<commit_message>
docs(deliverables): update university thesis status reports and WBS documentation
- Add Week 05 and Week 06 status reports
- Update Project Charter, SOW, and WBS benchmarking deliverables
</commit_message>
<xml_diff>
--- a/docs_ute/(1) PROJECT CHARTER & STATEMENT OF WORK (SOW).docx
+++ b/docs_ute/(1) PROJECT CHARTER & STATEMENT OF WORK (SOW).docx
@@ -1,6 +1,6 @@
 
 <file path=word/document.xml><?xml version="1.0" encoding="utf-8"?>
-<w:document xmlns:mc="http://schemas.openxmlformats.org/markup-compatibility/2006" xmlns:o="urn:schemas-microsoft-com:office:office" xmlns:r="http://schemas.openxmlformats.org/officeDocument/2006/relationships" xmlns:m="http://schemas.openxmlformats.org/officeDocument/2006/math" xmlns:v="urn:schemas-microsoft-com:vml" xmlns:wp="http://schemas.openxmlformats.org/drawingml/2006/wordprocessingDrawing" xmlns:w10="urn:schemas-microsoft-com:office:word" xmlns:w="http://schemas.openxmlformats.org/wordprocessingml/2006/main" xmlns:wne="http://schemas.microsoft.com/office/word/2006/wordml" xmlns:sl="http://schemas.openxmlformats.org/schemaLibrary/2006/main" xmlns:a="http://schemas.openxmlformats.org/drawingml/2006/main" xmlns:pic="http://schemas.openxmlformats.org/drawingml/2006/picture" xmlns:c="http://schemas.openxmlformats.org/drawingml/2006/chart" xmlns:lc="http://schemas.openxmlformats.org/drawingml/2006/lockedCanvas" xmlns:dgm="http://schemas.openxmlformats.org/drawingml/2006/diagram" xmlns:wps="http://schemas.microsoft.com/office/word/2010/wordprocessingShape" xmlns:wpg="http://schemas.microsoft.com/office/word/2010/wordprocessingGroup" xmlns:w14="http://schemas.microsoft.com/office/word/2010/wordml" xmlns:w15="http://schemas.microsoft.com/office/word/2012/wordml" xmlns:w16="http://schemas.microsoft.com/office/word/2018/wordml" xmlns:w16cex="http://schemas.microsoft.com/office/word/2018/wordml/cex" xmlns:w16cid="http://schemas.microsoft.com/office/word/2016/wordml/cid" xmlns="http://schemas.microsoft.com/office/tasks/2019/documenttasks" xmlns:cr="http://schemas.microsoft.com/office/comments/2020/reactions">
+<w:document xmlns:ns3="urn:schemas-microsoft-com:office:office" xmlns:v="urn:schemas-microsoft-com:vml" xmlns:w="http://schemas.openxmlformats.org/wordprocessingml/2006/main" xmlns:w14="http://schemas.microsoft.com/office/word/2010/wordml">
   <w:body>
     <w:p>
       <w:pPr>
@@ -167,7 +167,7 @@
       </w:pPr>
       <w:r>
         <w:pict>
-          <v:rect style="width:0.0pt;height:1.5pt" o:hr="t" o:hrstd="t" o:hralign="center" fillcolor="#A0A0A0" stroked="f"/>
+          <v:rect style="width:0.0pt;height:1.5pt" ns3:hr="t" ns3:hrstd="t" ns3:hralign="center" fillcolor="#A0A0A0" stroked="f"/>
         </w:pict>
       </w:r>
       <w:r>
@@ -447,7 +447,7 @@
       </w:pPr>
       <w:r>
         <w:pict>
-          <v:rect style="width:0.0pt;height:1.5pt" o:hr="t" o:hrstd="t" o:hralign="center" fillcolor="#A0A0A0" stroked="f"/>
+          <v:rect style="width:0.0pt;height:1.5pt" ns3:hr="t" ns3:hrstd="t" ns3:hralign="center" fillcolor="#A0A0A0" stroked="f"/>
         </w:pict>
       </w:r>
       <w:r>
@@ -942,7 +942,7 @@
       </w:pPr>
       <w:r>
         <w:pict>
-          <v:rect style="width:0.0pt;height:1.5pt" o:hr="t" o:hrstd="t" o:hralign="center" fillcolor="#A0A0A0" stroked="f"/>
+          <v:rect style="width:0.0pt;height:1.5pt" ns3:hr="t" ns3:hrstd="t" ns3:hralign="center" fillcolor="#A0A0A0" stroked="f"/>
         </w:pict>
       </w:r>
       <w:r>
@@ -1358,7 +1358,7 @@
       </w:pPr>
       <w:r>
         <w:pict>
-          <v:rect style="width:0.0pt;height:1.5pt" o:hr="t" o:hrstd="t" o:hralign="center" fillcolor="#A0A0A0" stroked="f"/>
+          <v:rect style="width:0.0pt;height:1.5pt" ns3:hr="t" ns3:hrstd="t" ns3:hralign="center" fillcolor="#A0A0A0" stroked="f"/>
         </w:pict>
       </w:r>
       <w:r>
@@ -1798,7 +1798,7 @@
                 <w:shd w:fill="auto" w:val="clear"/>
                 <w:rtl w:val="0"/>
               </w:rPr>
-              <w:t xml:space="preserve">Khởi tạo</w:t>
+              <w:t xml:space="preserve">Khởi tạo dự án &amp; Đặc tả yêu cầu (Phase 1)</w:t>
             </w:r>
           </w:p>
         </w:tc>
@@ -1843,7 +1843,7 @@
                 <w:shd w:fill="auto" w:val="clear"/>
                 <w:rtl w:val="0"/>
               </w:rPr>
-              <w:t xml:space="preserve">Kick-off Meeting</w:t>
+              <w:t xml:space="preserve">Chốt yêu cầu (Requirements Baseline Freeze)</w:t>
             </w:r>
           </w:p>
         </w:tc>
@@ -1888,7 +1888,7 @@
                 <w:shd w:fill="auto" w:val="clear"/>
                 <w:rtl w:val="0"/>
               </w:rPr>
-              <w:t xml:space="preserve">Project Charter, Kế hoạch dự án (Project Plan)</w:t>
+              <w:t xml:space="preserve">Project Charter, Kế hoạch dự án WBS, Hồ sơ SRS v1.0, Ma trận RTM</w:t>
             </w:r>
           </w:p>
         </w:tc>
@@ -1933,7 +1933,7 @@
                 <w:shd w:fill="auto" w:val="clear"/>
                 <w:rtl w:val="0"/>
               </w:rPr>
-              <w:t xml:space="preserve">Tuần 1</w:t>
+              <w:t xml:space="preserve">Tuần 1–3 (17/09/2026)</w:t>
             </w:r>
           </w:p>
         </w:tc>
@@ -2037,7 +2037,7 @@
                 <w:shd w:fill="auto" w:val="clear"/>
                 <w:rtl w:val="0"/>
               </w:rPr>
-              <w:t xml:space="preserve">Phân tích</w:t>
+              <w:t xml:space="preserve">Phân tích hệ thống &amp; Thiết kế kiến trúc, CSDL (Phase 2)</w:t>
             </w:r>
           </w:p>
         </w:tc>
@@ -2082,7 +2082,7 @@
                 <w:shd w:fill="auto" w:val="clear"/>
                 <w:rtl w:val="0"/>
               </w:rPr>
-              <w:t xml:space="preserve">Chốt yêu cầu (Sign-off)</w:t>
+              <w:t xml:space="preserve">Phê duyệt thiết kế &amp; Đóng băng cơ sở (M2 Baseline Freeze)</w:t>
             </w:r>
           </w:p>
         </w:tc>
@@ -2127,7 +2127,7 @@
                 <w:shd w:fill="auto" w:val="clear"/>
                 <w:rtl w:val="0"/>
               </w:rPr>
-              <w:t xml:space="preserve">Tài liệu đặc tả yêu cầu (SRS), Sơ đồ quy trình</w:t>
+              <w:t xml:space="preserve">Bộ mô hình UML 2.5.1, Kiến trúc Hexagonal, C4 Models, Database Diagram 10 bảng, Data Dictionary, 8 ADRs</w:t>
             </w:r>
           </w:p>
         </w:tc>
@@ -2172,7 +2172,7 @@
                 <w:shd w:fill="auto" w:val="clear"/>
                 <w:rtl w:val="0"/>
               </w:rPr>
-              <w:t xml:space="preserve">Tuần 3</w:t>
+              <w:t xml:space="preserve">Tuần 4–6 (08/10/2026)</w:t>
             </w:r>
           </w:p>
         </w:tc>
@@ -2276,7 +2276,7 @@
                 <w:shd w:fill="auto" w:val="clear"/>
                 <w:rtl w:val="0"/>
               </w:rPr>
-              <w:t xml:space="preserve">Thiết kế</w:t>
+              <w:t xml:space="preserve">Lập trình chức năng cốt lõi MVP &amp; Tích hợp AI (Phase 3)</w:t>
             </w:r>
           </w:p>
         </w:tc>
@@ -2321,7 +2321,7 @@
                 <w:shd w:fill="auto" w:val="clear"/>
                 <w:rtl w:val="0"/>
               </w:rPr>
-              <w:t xml:space="preserve">Phê duyệt thiết kế</w:t>
+              <w:t xml:space="preserve">Nghiệm thu bản MVP tích hợp AI (Milestone 3 Sign-off)</w:t>
             </w:r>
           </w:p>
         </w:tc>
@@ -2366,7 +2366,7 @@
                 <w:shd w:fill="auto" w:val="clear"/>
                 <w:rtl w:val="0"/>
               </w:rPr>
-              <w:t xml:space="preserve">Thiết kế CSDL, UI/UX Wireframe, Kiến trúc hệ thống</w:t>
+              <w:t xml:space="preserve">Mã nguồn FastAPI/Next.js, Adaptive Engine LLM, Study Space, Celery Beat Overdue Shift, WebCal Feed, Quota Guard</w:t>
             </w:r>
           </w:p>
         </w:tc>
@@ -2411,7 +2411,7 @@
                 <w:shd w:fill="auto" w:val="clear"/>
                 <w:rtl w:val="0"/>
               </w:rPr>
-              <w:t xml:space="preserve">Tuần 5</w:t>
+              <w:t xml:space="preserve">Tuần 7–11 (12/11/2026)</w:t>
             </w:r>
           </w:p>
         </w:tc>
@@ -2515,7 +2515,7 @@
                 <w:shd w:fill="auto" w:val="clear"/>
                 <w:rtl w:val="0"/>
               </w:rPr>
-              <w:t xml:space="preserve">Phát triển</w:t>
+              <w:t xml:space="preserve">Kiểm thử, UAT &amp; Đánh giá NFRs (Phase 4)</w:t>
             </w:r>
           </w:p>
         </w:tc>
@@ -2560,7 +2560,7 @@
                 <w:shd w:fill="auto" w:val="clear"/>
                 <w:rtl w:val="0"/>
               </w:rPr>
-              <w:t xml:space="preserve">Hoàn thành Coding (Beta)</w:t>
+              <w:t xml:space="preserve">Nghiệm thu thử nghiệm người dùng (UAT Sign-off)</w:t>
             </w:r>
           </w:p>
         </w:tc>
@@ -2605,7 +2605,7 @@
                 <w:shd w:fill="auto" w:val="clear"/>
                 <w:rtl w:val="0"/>
               </w:rPr>
-              <w:t xml:space="preserve">Mã nguồn (Source Code), Unit Test Report</w:t>
+              <w:t xml:space="preserve">Automated Test Suites (Unit/Integration), Báo cáo đo lường NFRs (Lighthouse, Latency, Security), Báo cáo UAT &amp; Khảo sát SUS</w:t>
             </w:r>
           </w:p>
         </w:tc>
@@ -2650,7 +2650,7 @@
                 <w:shd w:fill="auto" w:val="clear"/>
                 <w:rtl w:val="0"/>
               </w:rPr>
-              <w:t xml:space="preserve">Tuần 9</w:t>
+              <w:t xml:space="preserve">Tuần 12–13 (26/11/2026)</w:t>
             </w:r>
           </w:p>
         </w:tc>
@@ -2754,7 +2754,7 @@
                 <w:shd w:fill="auto" w:val="clear"/>
                 <w:rtl w:val="0"/>
               </w:rPr>
-              <w:t xml:space="preserve">Kiểm thử</w:t>
+              <w:t xml:space="preserve">Hoàn thiện Khóa luận, Slide &amp; Bảo vệ tốt nghiệp (Phase 5)</w:t>
             </w:r>
           </w:p>
         </w:tc>
@@ -2799,7 +2799,7 @@
                 <w:shd w:fill="auto" w:val="clear"/>
                 <w:rtl w:val="0"/>
               </w:rPr>
-              <w:t xml:space="preserve">User Acceptance Test (UAT)</w:t>
+              <w:t xml:space="preserve">Bảo vệ Khóa luận tốt nghiệp chính thức</w:t>
             </w:r>
           </w:p>
         </w:tc>
@@ -2844,7 +2844,7 @@
                 <w:shd w:fill="auto" w:val="clear"/>
                 <w:rtl w:val="0"/>
               </w:rPr>
-              <w:t xml:space="preserve">Kịch bản kiểm thử (Test Cases), Báo cáo lỗi (Bug Report)</w:t>
+              <w:t xml:space="preserve">Toàn văn Khóa luận tốt nghiệp (5 Chương), Slide báo cáo khoa học, Video Demo kịch bản, Biên bản bảo vệ</w:t>
             </w:r>
           </w:p>
         </w:tc>
@@ -2889,246 +2889,7 @@
                 <w:shd w:fill="auto" w:val="clear"/>
                 <w:rtl w:val="0"/>
               </w:rPr>
-              <w:t xml:space="preserve">Tuần 11</w:t>
-            </w:r>
-          </w:p>
-        </w:tc>
-      </w:tr>
-      <w:tr>
-        <w:trPr>
-          <w:cantSplit w:val="0"/>
-          <w:tblHeader w:val="0"/>
-        </w:trPr>
-        <w:tc>
-          <w:tcPr>
-            <w:tcBorders>
-              <w:top w:color="000000" w:space="0" w:sz="6" w:val="single"/>
-              <w:left w:color="000000" w:space="0" w:sz="6" w:val="single"/>
-              <w:bottom w:color="000000" w:space="0" w:sz="6" w:val="single"/>
-              <w:right w:color="000000" w:space="0" w:sz="6" w:val="single"/>
-            </w:tcBorders>
-            <w:shd w:fill="f8fafd" w:val="clear"/>
-            <w:tcMar>
-              <w:top w:w="120.0" w:type="dxa"/>
-              <w:left w:w="180.0" w:type="dxa"/>
-              <w:bottom w:w="120.0" w:type="dxa"/>
-              <w:right w:w="180.0" w:type="dxa"/>
-            </w:tcMar>
-            <w:vAlign w:val="top"/>
-          </w:tcPr>
-          <w:p>
-            <w:pPr>
-              <w:pBdr>
-                <w:top w:space="0" w:sz="0" w:val="nil"/>
-                <w:left w:space="0" w:sz="0" w:val="nil"/>
-                <w:bottom w:space="0" w:sz="0" w:val="nil"/>
-                <w:right w:space="0" w:sz="0" w:val="nil"/>
-                <w:between w:space="0" w:sz="0" w:val="nil"/>
-              </w:pBdr>
-              <w:shd w:fill="auto" w:val="clear"/>
-              <w:spacing w:after="120" w:before="120" w:line="275.9999942779541" w:lineRule="auto"/>
-              <w:rPr>
-                <w:rFonts w:ascii="Arial" w:cs="Arial" w:eastAsia="Arial" w:hAnsi="Arial"/>
-                <w:b w:val="1"/>
-                <w:bCs w:val="1"/>
-                <w:color w:val="1f1f1f"/>
-                <w:shd w:fill="auto" w:val="clear"/>
-              </w:rPr>
-            </w:pPr>
-            <w:r>
-              <w:rPr>
-                <w:rFonts w:ascii="Arial" w:cs="Arial" w:eastAsia="Arial" w:hAnsi="Arial"/>
-                <w:b w:val="1"/>
-                <w:bCs w:val="1"/>
-                <w:color w:val="1f1f1f"/>
-                <w:shd w:fill="auto" w:val="clear"/>
-                <w:rtl w:val="0"/>
-              </w:rPr>
-              <w:t xml:space="preserve">6.0</w:t>
-            </w:r>
-          </w:p>
-        </w:tc>
-        <w:tc>
-          <w:tcPr>
-            <w:tcBorders>
-              <w:top w:color="000000" w:space="0" w:sz="6" w:val="single"/>
-              <w:left w:color="000000" w:space="0" w:sz="6" w:val="single"/>
-              <w:bottom w:color="000000" w:space="0" w:sz="6" w:val="single"/>
-              <w:right w:color="000000" w:space="0" w:sz="6" w:val="single"/>
-            </w:tcBorders>
-            <w:shd w:fill="f8fafd" w:val="clear"/>
-            <w:tcMar>
-              <w:top w:w="120.0" w:type="dxa"/>
-              <w:left w:w="180.0" w:type="dxa"/>
-              <w:bottom w:w="120.0" w:type="dxa"/>
-              <w:right w:w="180.0" w:type="dxa"/>
-            </w:tcMar>
-            <w:vAlign w:val="top"/>
-          </w:tcPr>
-          <w:p>
-            <w:pPr>
-              <w:pBdr>
-                <w:top w:space="0" w:sz="0" w:val="nil"/>
-                <w:left w:space="0" w:sz="0" w:val="nil"/>
-                <w:bottom w:space="0" w:sz="0" w:val="nil"/>
-                <w:right w:space="0" w:sz="0" w:val="nil"/>
-                <w:between w:space="0" w:sz="0" w:val="nil"/>
-              </w:pBdr>
-              <w:shd w:fill="auto" w:val="clear"/>
-              <w:spacing w:after="120" w:before="120" w:line="275.9999942779541" w:lineRule="auto"/>
-              <w:rPr>
-                <w:rFonts w:ascii="Arial" w:cs="Arial" w:eastAsia="Arial" w:hAnsi="Arial"/>
-                <w:b w:val="1"/>
-                <w:bCs w:val="1"/>
-                <w:color w:val="1f1f1f"/>
-                <w:shd w:fill="auto" w:val="clear"/>
-              </w:rPr>
-            </w:pPr>
-            <w:r>
-              <w:rPr>
-                <w:rFonts w:ascii="Arial" w:cs="Arial" w:eastAsia="Arial" w:hAnsi="Arial"/>
-                <w:b w:val="1"/>
-                <w:bCs w:val="1"/>
-                <w:color w:val="1f1f1f"/>
-                <w:shd w:fill="auto" w:val="clear"/>
-                <w:rtl w:val="0"/>
-              </w:rPr>
-              <w:t xml:space="preserve">Đóng dự án</w:t>
-            </w:r>
-          </w:p>
-        </w:tc>
-        <w:tc>
-          <w:tcPr>
-            <w:tcBorders>
-              <w:top w:color="000000" w:space="0" w:sz="6" w:val="single"/>
-              <w:left w:color="000000" w:space="0" w:sz="6" w:val="single"/>
-              <w:bottom w:color="000000" w:space="0" w:sz="6" w:val="single"/>
-              <w:right w:color="000000" w:space="0" w:sz="6" w:val="single"/>
-            </w:tcBorders>
-            <w:shd w:fill="f8fafd" w:val="clear"/>
-            <w:tcMar>
-              <w:top w:w="120.0" w:type="dxa"/>
-              <w:left w:w="180.0" w:type="dxa"/>
-              <w:bottom w:w="120.0" w:type="dxa"/>
-              <w:right w:w="180.0" w:type="dxa"/>
-            </w:tcMar>
-            <w:vAlign w:val="top"/>
-          </w:tcPr>
-          <w:p>
-            <w:pPr>
-              <w:pBdr>
-                <w:top w:space="0" w:sz="0" w:val="nil"/>
-                <w:left w:space="0" w:sz="0" w:val="nil"/>
-                <w:bottom w:space="0" w:sz="0" w:val="nil"/>
-                <w:right w:space="0" w:sz="0" w:val="nil"/>
-                <w:between w:space="0" w:sz="0" w:val="nil"/>
-              </w:pBdr>
-              <w:shd w:fill="auto" w:val="clear"/>
-              <w:spacing w:after="120" w:before="120" w:line="275.9999942779541" w:lineRule="auto"/>
-              <w:rPr>
-                <w:rFonts w:ascii="Arial" w:cs="Arial" w:eastAsia="Arial" w:hAnsi="Arial"/>
-                <w:color w:val="1f1f1f"/>
-                <w:shd w:fill="auto" w:val="clear"/>
-              </w:rPr>
-            </w:pPr>
-            <w:r>
-              <w:rPr>
-                <w:rFonts w:ascii="Arial" w:cs="Arial" w:eastAsia="Arial" w:hAnsi="Arial"/>
-                <w:color w:val="1f1f1f"/>
-                <w:shd w:fill="auto" w:val="clear"/>
-                <w:rtl w:val="0"/>
-              </w:rPr>
-              <w:t xml:space="preserve">Báo cáo bảo vệ</w:t>
-            </w:r>
-          </w:p>
-        </w:tc>
-        <w:tc>
-          <w:tcPr>
-            <w:tcBorders>
-              <w:top w:color="000000" w:space="0" w:sz="6" w:val="single"/>
-              <w:left w:color="000000" w:space="0" w:sz="6" w:val="single"/>
-              <w:bottom w:color="000000" w:space="0" w:sz="6" w:val="single"/>
-              <w:right w:color="000000" w:space="0" w:sz="6" w:val="single"/>
-            </w:tcBorders>
-            <w:shd w:fill="f8fafd" w:val="clear"/>
-            <w:tcMar>
-              <w:top w:w="120.0" w:type="dxa"/>
-              <w:left w:w="180.0" w:type="dxa"/>
-              <w:bottom w:w="120.0" w:type="dxa"/>
-              <w:right w:w="180.0" w:type="dxa"/>
-            </w:tcMar>
-            <w:vAlign w:val="top"/>
-          </w:tcPr>
-          <w:p>
-            <w:pPr>
-              <w:pBdr>
-                <w:top w:space="0" w:sz="0" w:val="nil"/>
-                <w:left w:space="0" w:sz="0" w:val="nil"/>
-                <w:bottom w:space="0" w:sz="0" w:val="nil"/>
-                <w:right w:space="0" w:sz="0" w:val="nil"/>
-                <w:between w:space="0" w:sz="0" w:val="nil"/>
-              </w:pBdr>
-              <w:shd w:fill="auto" w:val="clear"/>
-              <w:spacing w:after="120" w:before="120" w:line="275.9999942779541" w:lineRule="auto"/>
-              <w:rPr>
-                <w:rFonts w:ascii="Arial" w:cs="Arial" w:eastAsia="Arial" w:hAnsi="Arial"/>
-                <w:color w:val="1f1f1f"/>
-                <w:shd w:fill="auto" w:val="clear"/>
-              </w:rPr>
-            </w:pPr>
-            <w:r>
-              <w:rPr>
-                <w:rFonts w:ascii="Arial" w:cs="Arial" w:eastAsia="Arial" w:hAnsi="Arial"/>
-                <w:color w:val="1f1f1f"/>
-                <w:shd w:fill="auto" w:val="clear"/>
-                <w:rtl w:val="0"/>
-              </w:rPr>
-              <w:t xml:space="preserve">Slide thuyết trình, Demo sản phẩm hoàn thiện, Tài liệu HDSD</w:t>
-            </w:r>
-          </w:p>
-        </w:tc>
-        <w:tc>
-          <w:tcPr>
-            <w:tcBorders>
-              <w:top w:color="000000" w:space="0" w:sz="6" w:val="single"/>
-              <w:left w:color="000000" w:space="0" w:sz="6" w:val="single"/>
-              <w:bottom w:color="000000" w:space="0" w:sz="6" w:val="single"/>
-              <w:right w:color="000000" w:space="0" w:sz="6" w:val="single"/>
-            </w:tcBorders>
-            <w:shd w:fill="f8fafd" w:val="clear"/>
-            <w:tcMar>
-              <w:top w:w="120.0" w:type="dxa"/>
-              <w:left w:w="180.0" w:type="dxa"/>
-              <w:bottom w:w="120.0" w:type="dxa"/>
-              <w:right w:w="180.0" w:type="dxa"/>
-            </w:tcMar>
-            <w:vAlign w:val="top"/>
-          </w:tcPr>
-          <w:p>
-            <w:pPr>
-              <w:pBdr>
-                <w:top w:space="0" w:sz="0" w:val="nil"/>
-                <w:left w:space="0" w:sz="0" w:val="nil"/>
-                <w:bottom w:space="0" w:sz="0" w:val="nil"/>
-                <w:right w:space="0" w:sz="0" w:val="nil"/>
-                <w:between w:space="0" w:sz="0" w:val="nil"/>
-              </w:pBdr>
-              <w:shd w:fill="auto" w:val="clear"/>
-              <w:spacing w:after="120" w:before="120" w:line="275.9999942779541" w:lineRule="auto"/>
-              <w:rPr>
-                <w:rFonts w:ascii="Arial" w:cs="Arial" w:eastAsia="Arial" w:hAnsi="Arial"/>
-                <w:color w:val="1f1f1f"/>
-                <w:shd w:fill="auto" w:val="clear"/>
-              </w:rPr>
-            </w:pPr>
-            <w:r>
-              <w:rPr>
-                <w:rFonts w:ascii="Arial" w:cs="Arial" w:eastAsia="Arial" w:hAnsi="Arial"/>
-                <w:color w:val="1f1f1f"/>
-                <w:shd w:fill="auto" w:val="clear"/>
-                <w:rtl w:val="0"/>
-              </w:rPr>
-              <w:t xml:space="preserve">Tuần 12</w:t>
+              <w:t xml:space="preserve">Tuần 14–15 (10/12/2026)</w:t>
             </w:r>
           </w:p>
         </w:tc>
@@ -3199,7 +2960,7 @@
       </w:pPr>
       <w:r>
         <w:pict>
-          <v:rect style="width:0.0pt;height:1.5pt" o:hr="t" o:hrstd="t" o:hralign="center" fillcolor="#A0A0A0" stroked="f"/>
+          <v:rect style="width:0.0pt;height:1.5pt" ns3:hr="t" ns3:hrstd="t" ns3:hralign="center" fillcolor="#A0A0A0" stroked="f"/>
         </w:pict>
       </w:r>
       <w:r>

</xml_diff>